<commit_message>
Adição de imagem de evidência ponto fraco
</commit_message>
<xml_diff>
--- a/documentos/entrega1_AP/Análise de Mercado e Concorrentes.docx
+++ b/documentos/entrega1_AP/Análise de Mercado e Concorrentes.docx
@@ -18,7 +18,7 @@
           <w:szCs w:val="26"/>
         </w:rPr>
       </w:pPr>
-      <w:bookmarkStart w:colFirst="0" w:colLast="0" w:name="_av3r0oqz4t3k" w:id="0"/>
+      <w:bookmarkStart w:colFirst="0" w:colLast="0" w:name="_k20eri8mdbm8" w:id="0"/>
       <w:bookmarkEnd w:id="0"/>
       <w:r>
         <w:rPr>
@@ -75,7 +75,7 @@
           <w:szCs w:val="22"/>
         </w:rPr>
       </w:pPr>
-      <w:bookmarkStart w:colFirst="0" w:colLast="0" w:name="_nrj6zh64xpy5" w:id="1"/>
+      <w:bookmarkStart w:colFirst="0" w:colLast="0" w:name="_mgsdg14f0r3q" w:id="1"/>
       <w:bookmarkEnd w:id="1"/>
       <w:r>
         <w:rPr>
@@ -113,8 +113,9 @@
           <w:ilvl w:val="0"/>
           <w:numId w:val="3"/>
         </w:numPr>
-        <w:spacing w:after="0" w:afterAutospacing="0" w:lineRule="auto"/>
+        <w:spacing w:after="0" w:lineRule="auto"/>
         <w:ind w:left="720" w:hanging="360"/>
+        <w:rPr/>
       </w:pPr>
       <w:r>
         <w:rPr>
@@ -137,8 +138,9 @@
           <w:ilvl w:val="0"/>
           <w:numId w:val="3"/>
         </w:numPr>
-        <w:spacing w:after="0" w:afterAutospacing="0" w:lineRule="auto"/>
+        <w:spacing w:after="0" w:lineRule="auto"/>
         <w:ind w:left="720" w:hanging="360"/>
+        <w:rPr/>
       </w:pPr>
       <w:r>
         <w:rPr>
@@ -175,8 +177,9 @@
           <w:ilvl w:val="0"/>
           <w:numId w:val="3"/>
         </w:numPr>
-        <w:spacing w:after="0" w:afterAutospacing="0" w:lineRule="auto"/>
+        <w:spacing w:after="0" w:lineRule="auto"/>
         <w:ind w:left="720" w:hanging="360"/>
+        <w:rPr/>
       </w:pPr>
       <w:r>
         <w:rPr>
@@ -186,6 +189,11 @@
         </w:rPr>
         <w:t xml:space="preserve">Pontos Fortes:</w:t>
       </w:r>
+      <w:r>
+        <w:rPr>
+          <w:rtl w:val="0"/>
+        </w:rPr>
+      </w:r>
     </w:p>
     <w:p>
       <w:pPr>
@@ -193,8 +201,9 @@
           <w:ilvl w:val="1"/>
           <w:numId w:val="3"/>
         </w:numPr>
-        <w:spacing w:after="0" w:afterAutospacing="0" w:lineRule="auto"/>
-        <w:ind w:left="1440" w:hanging="360"/>
+        <w:spacing w:after="0" w:lineRule="auto"/>
+        <w:ind w:left="1440" w:hanging="360"/>
+        <w:rPr/>
       </w:pPr>
       <w:r>
         <w:rPr>
@@ -209,8 +218,9 @@
           <w:ilvl w:val="1"/>
           <w:numId w:val="3"/>
         </w:numPr>
-        <w:spacing w:after="0" w:afterAutospacing="0" w:lineRule="auto"/>
-        <w:ind w:left="1440" w:hanging="360"/>
+        <w:spacing w:after="0" w:lineRule="auto"/>
+        <w:ind w:left="1440" w:hanging="360"/>
+        <w:rPr/>
       </w:pPr>
       <w:r>
         <w:rPr>
@@ -239,8 +249,9 @@
           <w:ilvl w:val="1"/>
           <w:numId w:val="3"/>
         </w:numPr>
-        <w:spacing w:after="0" w:afterAutospacing="0" w:lineRule="auto"/>
-        <w:ind w:left="1440" w:hanging="360"/>
+        <w:spacing w:after="0" w:lineRule="auto"/>
+        <w:ind w:left="1440" w:hanging="360"/>
+        <w:rPr/>
       </w:pPr>
       <w:r>
         <w:rPr>
@@ -255,8 +266,9 @@
           <w:ilvl w:val="0"/>
           <w:numId w:val="3"/>
         </w:numPr>
-        <w:spacing w:after="0" w:afterAutospacing="0" w:lineRule="auto"/>
+        <w:spacing w:after="0" w:lineRule="auto"/>
         <w:ind w:left="720" w:hanging="360"/>
+        <w:rPr/>
       </w:pPr>
       <w:r>
         <w:rPr>
@@ -266,6 +278,11 @@
         </w:rPr>
         <w:t xml:space="preserve">Pontos Fracos:</w:t>
       </w:r>
+      <w:r>
+        <w:rPr>
+          <w:rtl w:val="0"/>
+        </w:rPr>
+      </w:r>
     </w:p>
     <w:p>
       <w:pPr>
@@ -273,8 +290,9 @@
           <w:ilvl w:val="1"/>
           <w:numId w:val="3"/>
         </w:numPr>
-        <w:spacing w:after="0" w:afterAutospacing="0" w:lineRule="auto"/>
-        <w:ind w:left="1440" w:hanging="360"/>
+        <w:spacing w:after="0" w:lineRule="auto"/>
+        <w:ind w:left="1440" w:hanging="360"/>
+        <w:rPr/>
       </w:pPr>
       <w:r>
         <w:rPr>
@@ -289,8 +307,9 @@
           <w:ilvl w:val="1"/>
           <w:numId w:val="3"/>
         </w:numPr>
-        <w:spacing w:after="0" w:afterAutospacing="0" w:lineRule="auto"/>
-        <w:ind w:left="1440" w:hanging="360"/>
+        <w:spacing w:after="0" w:lineRule="auto"/>
+        <w:ind w:left="1440" w:hanging="360"/>
+        <w:rPr/>
       </w:pPr>
       <w:r>
         <w:rPr>
@@ -307,6 +326,7 @@
         </w:numPr>
         <w:spacing w:after="240" w:lineRule="auto"/>
         <w:ind w:left="1440" w:hanging="360"/>
+        <w:rPr/>
       </w:pPr>
       <w:r>
         <w:rPr>
@@ -339,8 +359,9 @@
           <w:ilvl w:val="0"/>
           <w:numId w:val="2"/>
         </w:numPr>
-        <w:spacing w:after="0" w:afterAutospacing="0" w:lineRule="auto"/>
+        <w:spacing w:after="0" w:lineRule="auto"/>
         <w:ind w:left="720" w:hanging="360"/>
+        <w:rPr/>
       </w:pPr>
       <w:r>
         <w:rPr>
@@ -363,8 +384,9 @@
           <w:ilvl w:val="0"/>
           <w:numId w:val="2"/>
         </w:numPr>
-        <w:spacing w:after="0" w:afterAutospacing="0" w:lineRule="auto"/>
+        <w:spacing w:after="0" w:lineRule="auto"/>
         <w:ind w:left="720" w:hanging="360"/>
+        <w:rPr/>
       </w:pPr>
       <w:r>
         <w:rPr>
@@ -401,8 +423,9 @@
           <w:ilvl w:val="0"/>
           <w:numId w:val="2"/>
         </w:numPr>
-        <w:spacing w:after="0" w:afterAutospacing="0" w:lineRule="auto"/>
+        <w:spacing w:after="0" w:lineRule="auto"/>
         <w:ind w:left="720" w:hanging="360"/>
+        <w:rPr/>
       </w:pPr>
       <w:r>
         <w:rPr>
@@ -412,6 +435,11 @@
         </w:rPr>
         <w:t xml:space="preserve">Pontos Fortes:</w:t>
       </w:r>
+      <w:r>
+        <w:rPr>
+          <w:rtl w:val="0"/>
+        </w:rPr>
+      </w:r>
     </w:p>
     <w:p>
       <w:pPr>
@@ -419,8 +447,9 @@
           <w:ilvl w:val="1"/>
           <w:numId w:val="2"/>
         </w:numPr>
-        <w:spacing w:after="0" w:afterAutospacing="0" w:lineRule="auto"/>
-        <w:ind w:left="1440" w:hanging="360"/>
+        <w:spacing w:after="0" w:lineRule="auto"/>
+        <w:ind w:left="1440" w:hanging="360"/>
+        <w:rPr/>
       </w:pPr>
       <w:r>
         <w:rPr>
@@ -435,8 +464,9 @@
           <w:ilvl w:val="1"/>
           <w:numId w:val="2"/>
         </w:numPr>
-        <w:spacing w:after="0" w:afterAutospacing="0" w:lineRule="auto"/>
-        <w:ind w:left="1440" w:hanging="360"/>
+        <w:spacing w:after="0" w:lineRule="auto"/>
+        <w:ind w:left="1440" w:hanging="360"/>
+        <w:rPr/>
       </w:pPr>
       <w:r>
         <w:rPr>
@@ -451,8 +481,9 @@
           <w:ilvl w:val="1"/>
           <w:numId w:val="2"/>
         </w:numPr>
-        <w:spacing w:after="0" w:afterAutospacing="0" w:lineRule="auto"/>
-        <w:ind w:left="1440" w:hanging="360"/>
+        <w:spacing w:after="0" w:lineRule="auto"/>
+        <w:ind w:left="1440" w:hanging="360"/>
+        <w:rPr/>
       </w:pPr>
       <w:r>
         <w:rPr>
@@ -481,8 +512,9 @@
           <w:ilvl w:val="0"/>
           <w:numId w:val="2"/>
         </w:numPr>
-        <w:spacing w:after="0" w:afterAutospacing="0" w:lineRule="auto"/>
+        <w:spacing w:after="0" w:lineRule="auto"/>
         <w:ind w:left="720" w:hanging="360"/>
+        <w:rPr/>
       </w:pPr>
       <w:r>
         <w:rPr>
@@ -492,6 +524,11 @@
         </w:rPr>
         <w:t xml:space="preserve">Pontos Fracos:</w:t>
       </w:r>
+      <w:r>
+        <w:rPr>
+          <w:rtl w:val="0"/>
+        </w:rPr>
+      </w:r>
     </w:p>
     <w:p>
       <w:pPr>
@@ -499,8 +536,9 @@
           <w:ilvl w:val="1"/>
           <w:numId w:val="2"/>
         </w:numPr>
-        <w:spacing w:after="0" w:afterAutospacing="0" w:lineRule="auto"/>
-        <w:ind w:left="1440" w:hanging="360"/>
+        <w:spacing w:after="0" w:lineRule="auto"/>
+        <w:ind w:left="1440" w:hanging="360"/>
+        <w:rPr/>
       </w:pPr>
       <w:r>
         <w:rPr>
@@ -515,8 +553,9 @@
           <w:ilvl w:val="1"/>
           <w:numId w:val="2"/>
         </w:numPr>
-        <w:spacing w:after="0" w:afterAutospacing="0" w:lineRule="auto"/>
-        <w:ind w:left="1440" w:hanging="360"/>
+        <w:spacing w:after="0" w:lineRule="auto"/>
+        <w:ind w:left="1440" w:hanging="360"/>
+        <w:rPr/>
       </w:pPr>
       <w:r>
         <w:rPr>
@@ -547,6 +586,7 @@
         </w:numPr>
         <w:spacing w:after="240" w:lineRule="auto"/>
         <w:ind w:left="1440" w:hanging="360"/>
+        <w:rPr/>
       </w:pPr>
       <w:r>
         <w:rPr>
@@ -593,8 +633,9 @@
           <w:ilvl w:val="0"/>
           <w:numId w:val="5"/>
         </w:numPr>
-        <w:spacing w:after="0" w:afterAutospacing="0" w:lineRule="auto"/>
+        <w:spacing w:after="0" w:lineRule="auto"/>
         <w:ind w:left="720" w:hanging="360"/>
+        <w:rPr/>
       </w:pPr>
       <w:r>
         <w:rPr>
@@ -631,8 +672,9 @@
           <w:ilvl w:val="0"/>
           <w:numId w:val="5"/>
         </w:numPr>
-        <w:spacing w:after="0" w:afterAutospacing="0" w:lineRule="auto"/>
+        <w:spacing w:after="0" w:lineRule="auto"/>
         <w:ind w:left="720" w:hanging="360"/>
+        <w:rPr/>
       </w:pPr>
       <w:r>
         <w:rPr>
@@ -683,8 +725,9 @@
           <w:ilvl w:val="0"/>
           <w:numId w:val="5"/>
         </w:numPr>
-        <w:spacing w:after="0" w:afterAutospacing="0" w:lineRule="auto"/>
+        <w:spacing w:after="0" w:lineRule="auto"/>
         <w:ind w:left="720" w:hanging="360"/>
+        <w:rPr/>
       </w:pPr>
       <w:r>
         <w:rPr>
@@ -694,6 +737,11 @@
         </w:rPr>
         <w:t xml:space="preserve">Pontos Fortes:</w:t>
       </w:r>
+      <w:r>
+        <w:rPr>
+          <w:rtl w:val="0"/>
+        </w:rPr>
+      </w:r>
     </w:p>
     <w:p>
       <w:pPr>
@@ -701,8 +749,9 @@
           <w:ilvl w:val="1"/>
           <w:numId w:val="5"/>
         </w:numPr>
-        <w:spacing w:after="0" w:afterAutospacing="0" w:lineRule="auto"/>
-        <w:ind w:left="1440" w:hanging="360"/>
+        <w:spacing w:after="0" w:lineRule="auto"/>
+        <w:ind w:left="1440" w:hanging="360"/>
+        <w:rPr/>
       </w:pPr>
       <w:r>
         <w:rPr>
@@ -717,8 +766,9 @@
           <w:ilvl w:val="1"/>
           <w:numId w:val="5"/>
         </w:numPr>
-        <w:spacing w:after="0" w:afterAutospacing="0" w:lineRule="auto"/>
-        <w:ind w:left="1440" w:hanging="360"/>
+        <w:spacing w:after="0" w:lineRule="auto"/>
+        <w:ind w:left="1440" w:hanging="360"/>
+        <w:rPr/>
       </w:pPr>
       <w:r>
         <w:rPr>
@@ -747,8 +797,9 @@
           <w:ilvl w:val="1"/>
           <w:numId w:val="5"/>
         </w:numPr>
-        <w:spacing w:after="0" w:afterAutospacing="0" w:lineRule="auto"/>
-        <w:ind w:left="1440" w:hanging="360"/>
+        <w:spacing w:after="0" w:lineRule="auto"/>
+        <w:ind w:left="1440" w:hanging="360"/>
+        <w:rPr/>
       </w:pPr>
       <w:r>
         <w:rPr>
@@ -763,8 +814,9 @@
           <w:ilvl w:val="0"/>
           <w:numId w:val="5"/>
         </w:numPr>
-        <w:spacing w:after="0" w:afterAutospacing="0" w:lineRule="auto"/>
+        <w:spacing w:after="0" w:lineRule="auto"/>
         <w:ind w:left="720" w:hanging="360"/>
+        <w:rPr/>
       </w:pPr>
       <w:r>
         <w:rPr>
@@ -774,6 +826,11 @@
         </w:rPr>
         <w:t xml:space="preserve">Pontos Fracos:</w:t>
       </w:r>
+      <w:r>
+        <w:rPr>
+          <w:rtl w:val="0"/>
+        </w:rPr>
+      </w:r>
     </w:p>
     <w:p>
       <w:pPr>
@@ -781,8 +838,9 @@
           <w:ilvl w:val="1"/>
           <w:numId w:val="5"/>
         </w:numPr>
-        <w:spacing w:after="0" w:afterAutospacing="0" w:lineRule="auto"/>
-        <w:ind w:left="1440" w:hanging="360"/>
+        <w:spacing w:after="0" w:lineRule="auto"/>
+        <w:ind w:left="1440" w:hanging="360"/>
+        <w:rPr/>
       </w:pPr>
       <w:r>
         <w:rPr>
@@ -797,8 +855,9 @@
           <w:ilvl w:val="1"/>
           <w:numId w:val="5"/>
         </w:numPr>
-        <w:spacing w:after="0" w:afterAutospacing="0" w:lineRule="auto"/>
-        <w:ind w:left="1440" w:hanging="360"/>
+        <w:spacing w:after="0" w:lineRule="auto"/>
+        <w:ind w:left="1440" w:hanging="360"/>
+        <w:rPr/>
       </w:pPr>
       <w:r>
         <w:rPr>
@@ -829,6 +888,7 @@
         </w:numPr>
         <w:spacing w:after="240" w:lineRule="auto"/>
         <w:ind w:left="1440" w:hanging="360"/>
+        <w:rPr/>
       </w:pPr>
       <w:r>
         <w:rPr>
@@ -861,8 +921,9 @@
           <w:ilvl w:val="0"/>
           <w:numId w:val="4"/>
         </w:numPr>
-        <w:spacing w:after="0" w:afterAutospacing="0" w:lineRule="auto"/>
+        <w:spacing w:after="0" w:lineRule="auto"/>
         <w:ind w:left="720" w:hanging="360"/>
+        <w:rPr/>
       </w:pPr>
       <w:r>
         <w:rPr>
@@ -913,8 +974,9 @@
           <w:ilvl w:val="0"/>
           <w:numId w:val="4"/>
         </w:numPr>
-        <w:spacing w:after="0" w:afterAutospacing="0" w:lineRule="auto"/>
+        <w:spacing w:after="0" w:lineRule="auto"/>
         <w:ind w:left="720" w:hanging="360"/>
+        <w:rPr/>
       </w:pPr>
       <w:r>
         <w:rPr>
@@ -951,8 +1013,9 @@
           <w:ilvl w:val="0"/>
           <w:numId w:val="4"/>
         </w:numPr>
-        <w:spacing w:after="0" w:afterAutospacing="0" w:lineRule="auto"/>
+        <w:spacing w:after="0" w:lineRule="auto"/>
         <w:ind w:left="720" w:hanging="360"/>
+        <w:rPr/>
       </w:pPr>
       <w:r>
         <w:rPr>
@@ -962,6 +1025,11 @@
         </w:rPr>
         <w:t xml:space="preserve">Pontos Fortes:</w:t>
       </w:r>
+      <w:r>
+        <w:rPr>
+          <w:rtl w:val="0"/>
+        </w:rPr>
+      </w:r>
     </w:p>
     <w:p>
       <w:pPr>
@@ -969,8 +1037,9 @@
           <w:ilvl w:val="1"/>
           <w:numId w:val="4"/>
         </w:numPr>
-        <w:spacing w:after="0" w:afterAutospacing="0" w:lineRule="auto"/>
-        <w:ind w:left="1440" w:hanging="360"/>
+        <w:spacing w:after="0" w:lineRule="auto"/>
+        <w:ind w:left="1440" w:hanging="360"/>
+        <w:rPr/>
       </w:pPr>
       <w:r>
         <w:rPr>
@@ -985,8 +1054,9 @@
           <w:ilvl w:val="1"/>
           <w:numId w:val="4"/>
         </w:numPr>
-        <w:spacing w:after="0" w:afterAutospacing="0" w:lineRule="auto"/>
-        <w:ind w:left="1440" w:hanging="360"/>
+        <w:spacing w:after="0" w:lineRule="auto"/>
+        <w:ind w:left="1440" w:hanging="360"/>
+        <w:rPr/>
       </w:pPr>
       <w:r>
         <w:rPr>
@@ -1001,8 +1071,9 @@
           <w:ilvl w:val="1"/>
           <w:numId w:val="4"/>
         </w:numPr>
-        <w:spacing w:after="0" w:afterAutospacing="0" w:lineRule="auto"/>
-        <w:ind w:left="1440" w:hanging="360"/>
+        <w:spacing w:after="0" w:lineRule="auto"/>
+        <w:ind w:left="1440" w:hanging="360"/>
+        <w:rPr/>
       </w:pPr>
       <w:r>
         <w:rPr>
@@ -1017,8 +1088,9 @@
           <w:ilvl w:val="0"/>
           <w:numId w:val="4"/>
         </w:numPr>
-        <w:spacing w:after="0" w:afterAutospacing="0" w:lineRule="auto"/>
+        <w:spacing w:after="0" w:lineRule="auto"/>
         <w:ind w:left="720" w:hanging="360"/>
+        <w:rPr/>
       </w:pPr>
       <w:r>
         <w:rPr>
@@ -1028,6 +1100,11 @@
         </w:rPr>
         <w:t xml:space="preserve">Pontos Fracos:</w:t>
       </w:r>
+      <w:r>
+        <w:rPr>
+          <w:rtl w:val="0"/>
+        </w:rPr>
+      </w:r>
     </w:p>
     <w:p>
       <w:pPr>
@@ -1035,8 +1112,9 @@
           <w:ilvl w:val="1"/>
           <w:numId w:val="4"/>
         </w:numPr>
-        <w:spacing w:after="0" w:afterAutospacing="0" w:lineRule="auto"/>
-        <w:ind w:left="1440" w:hanging="360"/>
+        <w:spacing w:after="0" w:lineRule="auto"/>
+        <w:ind w:left="1440" w:hanging="360"/>
+        <w:rPr/>
       </w:pPr>
       <w:r>
         <w:rPr>
@@ -1065,8 +1143,9 @@
           <w:ilvl w:val="1"/>
           <w:numId w:val="4"/>
         </w:numPr>
-        <w:spacing w:after="0" w:afterAutospacing="0" w:lineRule="auto"/>
-        <w:ind w:left="1440" w:hanging="360"/>
+        <w:spacing w:after="0" w:lineRule="auto"/>
+        <w:ind w:left="1440" w:hanging="360"/>
+        <w:rPr/>
       </w:pPr>
       <w:r>
         <w:rPr>
@@ -1083,6 +1162,7 @@
         </w:numPr>
         <w:spacing w:after="240" w:lineRule="auto"/>
         <w:ind w:left="1440" w:hanging="360"/>
+        <w:rPr/>
       </w:pPr>
       <w:r>
         <w:rPr>
@@ -1129,8 +1209,9 @@
           <w:ilvl w:val="0"/>
           <w:numId w:val="1"/>
         </w:numPr>
-        <w:spacing w:after="0" w:afterAutospacing="0" w:lineRule="auto"/>
+        <w:spacing w:after="0" w:lineRule="auto"/>
         <w:ind w:left="720" w:hanging="360"/>
+        <w:rPr/>
       </w:pPr>
       <w:r>
         <w:rPr>
@@ -1153,8 +1234,9 @@
           <w:ilvl w:val="0"/>
           <w:numId w:val="1"/>
         </w:numPr>
-        <w:spacing w:after="0" w:afterAutospacing="0" w:lineRule="auto"/>
+        <w:spacing w:after="0" w:lineRule="auto"/>
         <w:ind w:left="720" w:hanging="360"/>
+        <w:rPr/>
       </w:pPr>
       <w:r>
         <w:rPr>
@@ -1205,8 +1287,9 @@
           <w:ilvl w:val="0"/>
           <w:numId w:val="1"/>
         </w:numPr>
-        <w:spacing w:after="0" w:afterAutospacing="0" w:lineRule="auto"/>
+        <w:spacing w:after="0" w:lineRule="auto"/>
         <w:ind w:left="720" w:hanging="360"/>
+        <w:rPr/>
       </w:pPr>
       <w:r>
         <w:rPr>
@@ -1216,6 +1299,11 @@
         </w:rPr>
         <w:t xml:space="preserve">Pontos Fortes:</w:t>
       </w:r>
+      <w:r>
+        <w:rPr>
+          <w:rtl w:val="0"/>
+        </w:rPr>
+      </w:r>
     </w:p>
     <w:p>
       <w:pPr>
@@ -1223,8 +1311,9 @@
           <w:ilvl w:val="1"/>
           <w:numId w:val="1"/>
         </w:numPr>
-        <w:spacing w:after="0" w:afterAutospacing="0" w:lineRule="auto"/>
-        <w:ind w:left="1440" w:hanging="360"/>
+        <w:spacing w:after="0" w:lineRule="auto"/>
+        <w:ind w:left="1440" w:hanging="360"/>
+        <w:rPr/>
       </w:pPr>
       <w:r>
         <w:rPr>
@@ -1239,8 +1328,9 @@
           <w:ilvl w:val="1"/>
           <w:numId w:val="1"/>
         </w:numPr>
-        <w:spacing w:after="0" w:afterAutospacing="0" w:lineRule="auto"/>
-        <w:ind w:left="1440" w:hanging="360"/>
+        <w:spacing w:after="0" w:lineRule="auto"/>
+        <w:ind w:left="1440" w:hanging="360"/>
+        <w:rPr/>
       </w:pPr>
       <w:r>
         <w:rPr>
@@ -1255,8 +1345,9 @@
           <w:ilvl w:val="1"/>
           <w:numId w:val="1"/>
         </w:numPr>
-        <w:spacing w:after="0" w:afterAutospacing="0" w:lineRule="auto"/>
-        <w:ind w:left="1440" w:hanging="360"/>
+        <w:spacing w:after="0" w:lineRule="auto"/>
+        <w:ind w:left="1440" w:hanging="360"/>
+        <w:rPr/>
       </w:pPr>
       <w:r>
         <w:rPr>
@@ -1271,8 +1362,9 @@
           <w:ilvl w:val="0"/>
           <w:numId w:val="1"/>
         </w:numPr>
-        <w:spacing w:after="0" w:afterAutospacing="0" w:lineRule="auto"/>
+        <w:spacing w:after="0" w:lineRule="auto"/>
         <w:ind w:left="720" w:hanging="360"/>
+        <w:rPr/>
       </w:pPr>
       <w:r>
         <w:rPr>
@@ -1282,6 +1374,11 @@
         </w:rPr>
         <w:t xml:space="preserve">Pontos Fracos:</w:t>
       </w:r>
+      <w:r>
+        <w:rPr>
+          <w:rtl w:val="0"/>
+        </w:rPr>
+      </w:r>
     </w:p>
     <w:p>
       <w:pPr>
@@ -1289,46 +1386,14 @@
           <w:ilvl w:val="1"/>
           <w:numId w:val="1"/>
         </w:numPr>
-        <w:spacing w:after="0" w:afterAutospacing="0" w:lineRule="auto"/>
-        <w:ind w:left="1440" w:hanging="360"/>
-      </w:pPr>
-      <w:r>
-        <w:rPr>
-          <w:rtl w:val="0"/>
-        </w:rPr>
-        <w:t xml:space="preserve">Torna-se exagerado e complexo para equipes que realizam reuniões simples ou com pouca frequência, onde um documento simples já resolveria a necessidade.</w:t>
-      </w:r>
-    </w:p>
-    <w:p>
-      <w:pPr>
-        <w:numPr>
-          <w:ilvl w:val="1"/>
-          <w:numId w:val="1"/>
-        </w:numPr>
-        <w:spacing w:after="0" w:afterAutospacing="0" w:lineRule="auto"/>
-        <w:ind w:left="1440" w:hanging="360"/>
-      </w:pPr>
-      <w:r>
-        <w:rPr>
-          <w:rtl w:val="0"/>
-        </w:rPr>
-        <w:t xml:space="preserve">O gerenciamento de tarefas é limitado quando comparado a softwares especialistas em projetos, não lidando bem com dependências e planejamentos mais avançados.</w:t>
-      </w:r>
-    </w:p>
-    <w:p>
-      <w:pPr>
-        <w:numPr>
-          <w:ilvl w:val="1"/>
-          <w:numId w:val="1"/>
-        </w:numPr>
-        <w:spacing w:after="240" w:lineRule="auto"/>
-        <w:ind w:left="1440" w:hanging="360"/>
-      </w:pPr>
-      <w:r>
-        <w:rPr>
-          <w:rtl w:val="0"/>
-        </w:rPr>
-        <w:t xml:space="preserve">Gera forte dependência da ferramenta (</w:t>
+        <w:spacing w:after="240" w:line="276" w:lineRule="auto"/>
+        <w:ind w:left="1440" w:hanging="360"/>
+      </w:pPr>
+      <w:r>
+        <w:rPr>
+          <w:rtl w:val="0"/>
+        </w:rPr>
+        <w:t xml:space="preserve">O modelo comercial baseado em SaaS (</w:t>
       </w:r>
       <w:r>
         <w:rPr>
@@ -1336,13 +1401,135 @@
           <w:iCs w:val="1"/>
           <w:rtl w:val="0"/>
         </w:rPr>
-        <w:t xml:space="preserve">vendor lock-in</w:t>
-      </w:r>
-      <w:r>
-        <w:rPr>
-          <w:rtl w:val="0"/>
-        </w:rPr>
-        <w:t xml:space="preserve">) ao armazenar o histórico de decisões em um formato próprio e limita recursos importantes aos planos pagos.</w:t>
+        <w:t xml:space="preserve">Software as a Service</w:t>
+      </w:r>
+      <w:r>
+        <w:rPr>
+          <w:rtl w:val="0"/>
+        </w:rPr>
+        <w:t xml:space="preserve">, ou Software como Serviço) bloqueia funções avançadas atrás de assinaturas pagas, gerando barreira financeira para times pequenos. Na prática, isso significa que usuários de planos gratuitos ou básicos perdem acesso a recursos essenciais para o longo prazo, como o histórico completo de reuniões antigas (que costuma ser apagado ou bloqueado após alguns dias), a impossibilidade de exportar atas, a restrição de integrações vitais com gerenciadores de projetos (como o Jira) e o bloqueio de painéis de análise e relatórios de produtividade, obrigando a empresa a pagar para ter o ciclo de gestão completo. </w:t>
+      </w:r>
+    </w:p>
+    <w:p>
+      <w:pPr>
+        <w:spacing w:after="240" w:line="276" w:lineRule="auto"/>
+        <w:ind w:left="1440" w:firstLine="0"/>
+        <w:rPr/>
+      </w:pPr>
+      <w:r>
+        <w:rPr/>
+        <w:drawing>
+          <wp:inline distB="114300" distT="114300" distL="114300" distR="114300">
+            <wp:extent cx="5569212" cy="3117405"/>
+            <wp:effectExtent b="0" l="0" r="0" t="0"/>
+            <wp:docPr id="1" name="image2.png"/>
+            <a:graphic>
+              <a:graphicData uri="http://schemas.openxmlformats.org/drawingml/2006/picture">
+                <pic:pic>
+                  <pic:nvPicPr>
+                    <pic:cNvPr id="0" name="image2.png"/>
+                    <pic:cNvPicPr preferRelativeResize="0"/>
+                  </pic:nvPicPr>
+                  <pic:blipFill>
+                    <a:blip r:embed="rId6"/>
+                    <a:srcRect b="0" l="0" r="0" t="0"/>
+                    <a:stretch>
+                      <a:fillRect/>
+                    </a:stretch>
+                  </pic:blipFill>
+                  <pic:spPr>
+                    <a:xfrm>
+                      <a:off x="0" y="0"/>
+                      <a:ext cx="5569212" cy="3117405"/>
+                    </a:xfrm>
+                    <a:prstGeom prst="rect"/>
+                    <a:ln/>
+                  </pic:spPr>
+                </pic:pic>
+              </a:graphicData>
+            </a:graphic>
+          </wp:inline>
+        </w:drawing>
+      </w:r>
+      <w:r>
+        <w:rPr>
+          <w:rtl w:val="0"/>
+        </w:rPr>
+      </w:r>
+    </w:p>
+    <w:p>
+      <w:pPr>
+        <w:spacing w:after="240" w:line="276" w:lineRule="auto"/>
+        <w:ind w:left="1440" w:firstLine="0"/>
+        <w:rPr/>
+      </w:pPr>
+      <w:r>
+        <w:rPr/>
+        <w:drawing>
+          <wp:inline distB="114300" distT="114300" distL="114300" distR="114300">
+            <wp:extent cx="5618749" cy="3606629"/>
+            <wp:effectExtent b="0" l="0" r="0" t="0"/>
+            <wp:docPr id="2" name="image1.png"/>
+            <a:graphic>
+              <a:graphicData uri="http://schemas.openxmlformats.org/drawingml/2006/picture">
+                <pic:pic>
+                  <pic:nvPicPr>
+                    <pic:cNvPr id="0" name="image1.png"/>
+                    <pic:cNvPicPr preferRelativeResize="0"/>
+                  </pic:nvPicPr>
+                  <pic:blipFill>
+                    <a:blip r:embed="rId7"/>
+                    <a:srcRect b="0" l="0" r="0" t="0"/>
+                    <a:stretch>
+                      <a:fillRect/>
+                    </a:stretch>
+                  </pic:blipFill>
+                  <pic:spPr>
+                    <a:xfrm>
+                      <a:off x="0" y="0"/>
+                      <a:ext cx="5618749" cy="3606629"/>
+                    </a:xfrm>
+                    <a:prstGeom prst="rect"/>
+                    <a:ln/>
+                  </pic:spPr>
+                </pic:pic>
+              </a:graphicData>
+            </a:graphic>
+          </wp:inline>
+        </w:drawing>
+      </w:r>
+      <w:r>
+        <w:rPr>
+          <w:rtl w:val="0"/>
+        </w:rPr>
+      </w:r>
+    </w:p>
+    <w:p>
+      <w:pPr>
+        <w:spacing w:after="240" w:line="276" w:lineRule="auto"/>
+        <w:ind w:left="1440" w:firstLine="0"/>
+        <w:rPr/>
+      </w:pPr>
+      <w:r>
+        <w:rPr>
+          <w:rtl w:val="0"/>
+        </w:rPr>
+        <w:t xml:space="preserve">Link da imagem: </w:t>
+      </w:r>
+      <w:hyperlink r:id="rId8">
+        <w:r>
+          <w:rPr>
+            <w:color w:val="1155cc"/>
+            <w:u w:val="single"/>
+            <w:rtl w:val="0"/>
+          </w:rPr>
+          <w:t xml:space="preserve">More integrations</w:t>
+        </w:r>
+      </w:hyperlink>
+      <w:r>
+        <w:rPr>
+          <w:rtl w:val="0"/>
+        </w:rPr>
       </w:r>
     </w:p>
     <w:p>
@@ -1361,7 +1548,7 @@
           <w:szCs w:val="22"/>
         </w:rPr>
       </w:pPr>
-      <w:bookmarkStart w:colFirst="0" w:colLast="0" w:name="_encth4ywpmzs" w:id="2"/>
+      <w:bookmarkStart w:colFirst="0" w:colLast="0" w:name="_uphzwgi8sn8f" w:id="2"/>
       <w:bookmarkEnd w:id="2"/>
       <w:r>
         <w:rPr>

</xml_diff>

<commit_message>
Adição de imagens sobre o Beenote
</commit_message>
<xml_diff>
--- a/documentos/entrega1_AP/Análise de Mercado e Concorrentes.docx
+++ b/documentos/entrega1_AP/Análise de Mercado e Concorrentes.docx
@@ -18,7 +18,7 @@
           <w:szCs w:val="26"/>
         </w:rPr>
       </w:pPr>
-      <w:bookmarkStart w:colFirst="0" w:colLast="0" w:name="_k20eri8mdbm8" w:id="0"/>
+      <w:bookmarkStart w:colFirst="0" w:colLast="0" w:name="_i4lmeolke8xb" w:id="0"/>
       <w:bookmarkEnd w:id="0"/>
       <w:r>
         <w:rPr>
@@ -75,7 +75,7 @@
           <w:szCs w:val="22"/>
         </w:rPr>
       </w:pPr>
-      <w:bookmarkStart w:colFirst="0" w:colLast="0" w:name="_mgsdg14f0r3q" w:id="1"/>
+      <w:bookmarkStart w:colFirst="0" w:colLast="0" w:name="_5ki7yy4f3nyb" w:id="1"/>
       <w:bookmarkEnd w:id="1"/>
       <w:r>
         <w:rPr>
@@ -612,6 +612,100 @@
     <w:p>
       <w:pPr>
         <w:spacing w:after="240" w:lineRule="auto"/>
+        <w:ind w:left="0" w:firstLine="0"/>
+        <w:rPr/>
+      </w:pPr>
+      <w:r>
+        <w:rPr/>
+        <w:drawing>
+          <wp:inline distB="114300" distT="114300" distL="114300" distR="114300">
+            <wp:extent cx="5943600" cy="3111500"/>
+            <wp:effectExtent b="0" l="0" r="0" t="0"/>
+            <wp:docPr id="4" name="image3.png"/>
+            <a:graphic>
+              <a:graphicData uri="http://schemas.openxmlformats.org/drawingml/2006/picture">
+                <pic:pic>
+                  <pic:nvPicPr>
+                    <pic:cNvPr id="0" name="image3.png"/>
+                    <pic:cNvPicPr preferRelativeResize="0"/>
+                  </pic:nvPicPr>
+                  <pic:blipFill>
+                    <a:blip r:embed="rId6"/>
+                    <a:srcRect b="0" l="0" r="0" t="0"/>
+                    <a:stretch>
+                      <a:fillRect/>
+                    </a:stretch>
+                  </pic:blipFill>
+                  <pic:spPr>
+                    <a:xfrm>
+                      <a:off x="0" y="0"/>
+                      <a:ext cx="5943600" cy="3111500"/>
+                    </a:xfrm>
+                    <a:prstGeom prst="rect"/>
+                    <a:ln/>
+                  </pic:spPr>
+                </pic:pic>
+              </a:graphicData>
+            </a:graphic>
+          </wp:inline>
+        </w:drawing>
+      </w:r>
+      <w:r>
+        <w:rPr>
+          <w:rtl w:val="0"/>
+        </w:rPr>
+      </w:r>
+    </w:p>
+    <w:p>
+      <w:pPr>
+        <w:spacing w:after="240" w:lineRule="auto"/>
+        <w:ind w:left="0" w:firstLine="0"/>
+        <w:rPr/>
+      </w:pPr>
+      <w:r>
+        <w:rPr/>
+        <w:drawing>
+          <wp:inline distB="114300" distT="114300" distL="114300" distR="114300">
+            <wp:extent cx="5943600" cy="3086100"/>
+            <wp:effectExtent b="0" l="0" r="0" t="0"/>
+            <wp:docPr id="1" name="image4.png"/>
+            <a:graphic>
+              <a:graphicData uri="http://schemas.openxmlformats.org/drawingml/2006/picture">
+                <pic:pic>
+                  <pic:nvPicPr>
+                    <pic:cNvPr id="0" name="image4.png"/>
+                    <pic:cNvPicPr preferRelativeResize="0"/>
+                  </pic:nvPicPr>
+                  <pic:blipFill>
+                    <a:blip r:embed="rId7"/>
+                    <a:srcRect b="0" l="0" r="0" t="0"/>
+                    <a:stretch>
+                      <a:fillRect/>
+                    </a:stretch>
+                  </pic:blipFill>
+                  <pic:spPr>
+                    <a:xfrm>
+                      <a:off x="0" y="0"/>
+                      <a:ext cx="5943600" cy="3086100"/>
+                    </a:xfrm>
+                    <a:prstGeom prst="rect"/>
+                    <a:ln/>
+                  </pic:spPr>
+                </pic:pic>
+              </a:graphicData>
+            </a:graphic>
+          </wp:inline>
+        </w:drawing>
+      </w:r>
+      <w:r>
+        <w:rPr>
+          <w:rtl w:val="0"/>
+        </w:rPr>
+      </w:r>
+    </w:p>
+    <w:p>
+      <w:pPr>
+        <w:spacing w:after="240" w:lineRule="auto"/>
         <w:jc w:val="both"/>
         <w:rPr>
           <w:b w:val="1"/>
@@ -1388,6 +1482,7 @@
         </w:numPr>
         <w:spacing w:after="240" w:line="276" w:lineRule="auto"/>
         <w:ind w:left="1440" w:hanging="360"/>
+        <w:rPr/>
       </w:pPr>
       <w:r>
         <w:rPr>
@@ -1422,16 +1517,16 @@
           <wp:inline distB="114300" distT="114300" distL="114300" distR="114300">
             <wp:extent cx="5569212" cy="3117405"/>
             <wp:effectExtent b="0" l="0" r="0" t="0"/>
-            <wp:docPr id="1" name="image2.png"/>
+            <wp:docPr id="2" name="image1.png"/>
             <a:graphic>
               <a:graphicData uri="http://schemas.openxmlformats.org/drawingml/2006/picture">
                 <pic:pic>
                   <pic:nvPicPr>
-                    <pic:cNvPr id="0" name="image2.png"/>
+                    <pic:cNvPr id="0" name="image1.png"/>
                     <pic:cNvPicPr preferRelativeResize="0"/>
                   </pic:nvPicPr>
                   <pic:blipFill>
-                    <a:blip r:embed="rId6"/>
+                    <a:blip r:embed="rId8"/>
                     <a:srcRect b="0" l="0" r="0" t="0"/>
                     <a:stretch>
                       <a:fillRect/>
@@ -1469,16 +1564,16 @@
           <wp:inline distB="114300" distT="114300" distL="114300" distR="114300">
             <wp:extent cx="5618749" cy="3606629"/>
             <wp:effectExtent b="0" l="0" r="0" t="0"/>
-            <wp:docPr id="2" name="image1.png"/>
+            <wp:docPr id="3" name="image2.png"/>
             <a:graphic>
               <a:graphicData uri="http://schemas.openxmlformats.org/drawingml/2006/picture">
                 <pic:pic>
                   <pic:nvPicPr>
-                    <pic:cNvPr id="0" name="image1.png"/>
+                    <pic:cNvPr id="0" name="image2.png"/>
                     <pic:cNvPicPr preferRelativeResize="0"/>
                   </pic:nvPicPr>
                   <pic:blipFill>
-                    <a:blip r:embed="rId7"/>
+                    <a:blip r:embed="rId9"/>
                     <a:srcRect b="0" l="0" r="0" t="0"/>
                     <a:stretch>
                       <a:fillRect/>
@@ -1516,7 +1611,7 @@
         </w:rPr>
         <w:t xml:space="preserve">Link da imagem: </w:t>
       </w:r>
-      <w:hyperlink r:id="rId8">
+      <w:hyperlink r:id="rId10">
         <w:r>
           <w:rPr>
             <w:color w:val="1155cc"/>
@@ -1548,7 +1643,7 @@
           <w:szCs w:val="22"/>
         </w:rPr>
       </w:pPr>
-      <w:bookmarkStart w:colFirst="0" w:colLast="0" w:name="_uphzwgi8sn8f" w:id="2"/>
+      <w:bookmarkStart w:colFirst="0" w:colLast="0" w:name="_tqhz5wd6l61j" w:id="2"/>
       <w:bookmarkEnd w:id="2"/>
       <w:r>
         <w:rPr>

</xml_diff>